<commit_message>
[unplanned] update /dcs/rfid per eng
</commit_message>
<xml_diff>
--- a/dcs/rfid/android/docs/Dw-SF-Concurrency.docx
+++ b/dcs/rfid/android/docs/Dw-SF-Concurrency.docx
@@ -40,13 +40,8 @@
       <w:r>
         <w:t xml:space="preserve">, RFD40/90 barcode scanner is not available for </w:t>
       </w:r>
-      <w:proofErr w:type="spellStart"/>
-      <w:r>
-        <w:t>Datawedge</w:t>
-      </w:r>
-      <w:proofErr w:type="spellEnd"/>
-      <w:r>
-        <w:t xml:space="preserve"> and can be accessed only through integrated RFID SDK</w:t>
+      <w:r>
+        <w:t>Datawedge and can be accessed only through integrated RFID SDK</w:t>
       </w:r>
       <w:r>
         <w:t xml:space="preserve">. If </w:t>
@@ -55,15 +50,7 @@
         <w:t>users</w:t>
       </w:r>
       <w:r>
-        <w:t xml:space="preserve"> need to use RFD40/90 scanner for </w:t>
-      </w:r>
-      <w:proofErr w:type="spellStart"/>
-      <w:r>
-        <w:t>Datawedge</w:t>
-      </w:r>
-      <w:proofErr w:type="spellEnd"/>
-      <w:r>
-        <w:t xml:space="preserve"> along with </w:t>
+        <w:t xml:space="preserve"> need to use RFD40/90 scanner for Datawedge along with </w:t>
       </w:r>
       <w:r>
         <w:t xml:space="preserve">integrated RFID </w:t>
@@ -72,15 +59,7 @@
         <w:t>applications,</w:t>
       </w:r>
       <w:r>
-        <w:t xml:space="preserve"> then </w:t>
-      </w:r>
-      <w:proofErr w:type="gramStart"/>
-      <w:r>
-        <w:t>user</w:t>
-      </w:r>
-      <w:proofErr w:type="gramEnd"/>
-      <w:r>
-        <w:t xml:space="preserve"> need to configure </w:t>
+        <w:t xml:space="preserve"> then user need to configure </w:t>
       </w:r>
       <w:r>
         <w:t xml:space="preserve">the device for new co-existence mode. </w:t>
@@ -159,15 +138,7 @@
         <w:t xml:space="preserve">until scanning framework finishes the enumeration which takes around 10 seconds. During this </w:t>
       </w:r>
       <w:r>
-        <w:t xml:space="preserve">period scanner </w:t>
-      </w:r>
-      <w:proofErr w:type="spellStart"/>
-      <w:r>
-        <w:t>init</w:t>
-      </w:r>
-      <w:proofErr w:type="spellEnd"/>
-      <w:r>
-        <w:t xml:space="preserve"> API</w:t>
+        <w:t>period scanner init API</w:t>
       </w:r>
       <w:r>
         <w:t xml:space="preserve"> </w:t>
@@ -182,21 +153,8 @@
       </w:pPr>
     </w:p>
     <w:p>
-      <w:proofErr w:type="spellStart"/>
-      <w:r>
-        <w:t>sdkHandler.setSfCoexistenceModeInit</w:t>
-      </w:r>
-      <w:proofErr w:type="spellEnd"/>
-      <w:r>
-        <w:t xml:space="preserve">(new </w:t>
-      </w:r>
-      <w:proofErr w:type="spellStart"/>
-      <w:r>
-        <w:t>SDKHandler.SfCoexistenceResultListener</w:t>
-      </w:r>
-      <w:proofErr w:type="spellEnd"/>
-      <w:r>
-        <w:t>() {</w:t>
+      <w:r>
+        <w:t>sdkHandler.setSfCoexistenceModeInit(new SDKHandler.SfCoexistenceResultListener() {</w:t>
       </w:r>
       <w:r>
         <w:br/>
@@ -204,31 +162,7 @@
       </w:r>
       <w:r>
         <w:br/>
-        <w:t xml:space="preserve">    public void </w:t>
-      </w:r>
-      <w:proofErr w:type="spellStart"/>
-      <w:r>
-        <w:t>onResult</w:t>
-      </w:r>
-      <w:proofErr w:type="spellEnd"/>
-      <w:r>
-        <w:t>(</w:t>
-      </w:r>
-      <w:proofErr w:type="spellStart"/>
-      <w:r>
-        <w:t>SfCoexistenceResult</w:t>
-      </w:r>
-      <w:proofErr w:type="spellEnd"/>
-      <w:r>
-        <w:t xml:space="preserve"> </w:t>
-      </w:r>
-      <w:proofErr w:type="spellStart"/>
-      <w:r>
-        <w:t>sfCoexistenceResult</w:t>
-      </w:r>
-      <w:proofErr w:type="spellEnd"/>
-      <w:r>
-        <w:t>) {</w:t>
+        <w:t xml:space="preserve">    public void onResult(SfCoexistenceResult sfCoexistenceResult) {</w:t>
       </w:r>
       <w:r>
         <w:br/>
@@ -236,15 +170,7 @@
       </w:r>
       <w:r>
         <w:br/>
-        <w:t xml:space="preserve">        switch (</w:t>
-      </w:r>
-      <w:proofErr w:type="spellStart"/>
-      <w:r>
-        <w:t>sfCoexistenceResult</w:t>
-      </w:r>
-      <w:proofErr w:type="spellEnd"/>
-      <w:r>
-        <w:t>){</w:t>
+        <w:t xml:space="preserve">        switch (sfCoexistenceResult){</w:t>
       </w:r>
       <w:r>
         <w:br/>
@@ -282,15 +208,7 @@
       </w:r>
       <w:r>
         <w:br/>
-        <w:t xml:space="preserve">                //Reader not configured to SSI </w:t>
-      </w:r>
-      <w:proofErr w:type="spellStart"/>
-      <w:r>
-        <w:t>datawedge</w:t>
-      </w:r>
-      <w:proofErr w:type="spellEnd"/>
-      <w:r>
-        <w:t xml:space="preserve"> mode</w:t>
+        <w:t xml:space="preserve">                //Reader not configured to SSI datawedge mode</w:t>
       </w:r>
       <w:r>
         <w:br/>
@@ -313,7 +231,6 @@
       <w:r>
         <w:t xml:space="preserve">Note: User needs to call </w:t>
       </w:r>
-      <w:proofErr w:type="spellStart"/>
       <w:r>
         <w:rPr>
           <w:b/>
@@ -321,31 +238,14 @@
         </w:rPr>
         <w:t>setSfCoexistenceModeInit</w:t>
       </w:r>
-      <w:proofErr w:type="spellEnd"/>
-      <w:r>
-        <w:t xml:space="preserve"> as the first API call immediately after creating </w:t>
-      </w:r>
-      <w:proofErr w:type="spellStart"/>
-      <w:r>
-        <w:t>sdkhandler</w:t>
-      </w:r>
-      <w:proofErr w:type="spellEnd"/>
-      <w:r>
-        <w:t xml:space="preserve"> instance.</w:t>
+      <w:r>
+        <w:t xml:space="preserve"> as the first API call immediately after creating sdkhandler instance.</w:t>
       </w:r>
     </w:p>
     <w:p/>
     <w:p>
       <w:r>
-        <w:t xml:space="preserve">Callback </w:t>
-      </w:r>
-      <w:proofErr w:type="gramStart"/>
-      <w:r>
-        <w:t>listener</w:t>
-      </w:r>
-      <w:proofErr w:type="gramEnd"/>
-      <w:r>
-        <w:t xml:space="preserve"> </w:t>
+        <w:t xml:space="preserve">Callback listener </w:t>
       </w:r>
       <w:r>
         <w:t xml:space="preserve">will </w:t>
@@ -432,6 +332,9 @@
       <w:r>
         <w:t xml:space="preserve">Firmware version </w:t>
       </w:r>
+      <w:r>
+        <w:t>SAAFKS00-011-R01E0</w:t>
+      </w:r>
     </w:p>
     <w:p>
       <w:pPr>
@@ -445,7 +348,13 @@
         <w:t xml:space="preserve">Scanning framework </w:t>
       </w:r>
       <w:r>
-        <w:t xml:space="preserve">2025 NOV LG release </w:t>
+        <w:t xml:space="preserve">2025 </w:t>
+      </w:r>
+      <w:r>
+        <w:t>December</w:t>
+      </w:r>
+      <w:r>
+        <w:t xml:space="preserve"> LG release </w:t>
       </w:r>
     </w:p>
     <w:p>
@@ -487,35 +396,9 @@
       </w:r>
     </w:p>
     <w:p>
-      <w:proofErr w:type="spellStart"/>
-      <w:r>
-        <w:t>boolean</w:t>
-      </w:r>
-      <w:proofErr w:type="spellEnd"/>
-      <w:r>
-        <w:t xml:space="preserve"> </w:t>
-      </w:r>
-      <w:proofErr w:type="spellStart"/>
-      <w:r>
-        <w:t>isReaderInUsbDatawedgeMode</w:t>
-      </w:r>
-      <w:proofErr w:type="spellEnd"/>
-      <w:r>
-        <w:t xml:space="preserve"> = </w:t>
-      </w:r>
-      <w:proofErr w:type="spellStart"/>
-      <w:r>
-        <w:t>sdkHandler.isSSIDwInterfaceCDCScannerAvailable</w:t>
-      </w:r>
-      <w:proofErr w:type="spellEnd"/>
-      <w:r>
-        <w:t>(</w:t>
-      </w:r>
-      <w:proofErr w:type="gramStart"/>
-      <w:r>
-        <w:t>);</w:t>
-      </w:r>
-      <w:proofErr w:type="gramEnd"/>
+      <w:r>
+        <w:t>boolean isReaderInUsbDatawedgeMode = sdkHandler.isSSIDwInterfaceCDCScannerAvailable();</w:t>
+      </w:r>
     </w:p>
     <w:p/>
     <w:p>
@@ -696,7 +579,7 @@
         <w:rPr>
           <w:rFonts w:ascii="Aptos" w:eastAsia="Aptos" w:hAnsi="Aptos" w:cs="Aptos"/>
         </w:rPr>
-        <w:t>SAAFKS00-011-N02</w:t>
+        <w:t>SAAFKS00-011-R01E0.DAT</w:t>
       </w:r>
       <w:r>
         <w:rPr>
@@ -724,7 +607,13 @@
         <w:spacing w:line="257" w:lineRule="auto"/>
       </w:pPr>
       <w:r>
-        <w:t>Scanning framework 2025 NOV LG release</w:t>
+        <w:t xml:space="preserve">Scanning framework 2025 </w:t>
+      </w:r>
+      <w:r>
+        <w:t>December</w:t>
+      </w:r>
+      <w:r>
+        <w:t xml:space="preserve"> LG release</w:t>
       </w:r>
     </w:p>
     <w:p>
@@ -736,10 +625,7 @@
         </w:numPr>
       </w:pPr>
       <w:r>
-        <w:t>123RFID Desktop 3.0.0.6</w:t>
-      </w:r>
-      <w:r>
-        <w:t xml:space="preserve">2  </w:t>
+        <w:t xml:space="preserve">123RFID Desktop 3.0.0.62  </w:t>
       </w:r>
       <w:hyperlink r:id="rId11" w:history="1">
         <w:r>
@@ -783,13 +669,13 @@
         <w:rPr>
           <w:rFonts w:ascii="Aptos" w:eastAsia="Aptos" w:hAnsi="Aptos" w:cs="Aptos"/>
         </w:rPr>
-        <w:t>SAAFKS00-011-N02</w:t>
-      </w:r>
-      <w:r>
-        <w:rPr>
-          <w:rFonts w:ascii="Aptos" w:eastAsia="Aptos" w:hAnsi="Aptos" w:cs="Aptos"/>
-        </w:rPr>
-        <w:t xml:space="preserve">   to verify data wedge support</w:t>
+        <w:t>SAAFKS00-011-R01E0</w:t>
+      </w:r>
+      <w:r>
+        <w:rPr>
+          <w:rFonts w:ascii="Aptos" w:eastAsia="Aptos" w:hAnsi="Aptos" w:cs="Aptos"/>
+        </w:rPr>
+        <w:t xml:space="preserve">  to verify data wedge support</w:t>
       </w:r>
     </w:p>
     <w:p>
@@ -837,13 +723,7 @@
         <w:rPr>
           <w:rFonts w:ascii="Aptos" w:eastAsia="Aptos" w:hAnsi="Aptos" w:cs="Aptos"/>
         </w:rPr>
-        <w:t>SAAFKS</w:t>
-      </w:r>
-      <w:r>
-        <w:rPr>
-          <w:rFonts w:ascii="Aptos" w:eastAsia="Aptos" w:hAnsi="Aptos" w:cs="Aptos"/>
-        </w:rPr>
-        <w:t>00-011-N02</w:t>
+        <w:t>SAAFKS00-011-R01E0</w:t>
       </w:r>
     </w:p>
     <w:p>
@@ -1154,13 +1034,8 @@
         <w:t xml:space="preserve">In </w:t>
       </w:r>
       <w:r>
-        <w:t xml:space="preserve">scenario where RFDXX device is configured for USB </w:t>
-      </w:r>
-      <w:proofErr w:type="spellStart"/>
-      <w:r>
-        <w:t>Datawedge</w:t>
-      </w:r>
-      <w:proofErr w:type="spellEnd"/>
+        <w:t>scenario where RFDXX device is configured for USB Datawedge</w:t>
+      </w:r>
       <w:r>
         <w:t xml:space="preserve"> and when you try to connect using incompatible or the old BSP user will observe connection failures.</w:t>
       </w:r>

</xml_diff>